<commit_message>
Add Mail Merge versions (Y, X, O), database version (Z), updated README
</commit_message>
<xml_diff>
--- a/templates/DOCUMENT_TEMPLATE_FILE.docx
+++ b/templates/DOCUMENT_TEMPLATE_FILE.docx
@@ -80,6 +80,7 @@
               </w:rPr>
               <w:t xml:space="preserve"> </w:t>
             </w:r>
+            <w:proofErr w:type="gramStart"/>
             <w:r>
               <w:rPr>
                 <w:b/>
@@ -91,7 +92,6 @@
               <w:rPr>
                 <w:b/>
                 <w:bCs/>
-                <w:spacing w:val="-2"/>
               </w:rPr>
               <w:t xml:space="preserve"> </w:t>
             </w:r>
@@ -101,32 +101,19 @@
                 <w:bCs/>
                 <w:spacing w:val="-2"/>
               </w:rPr>
-              <w:t>FNO</w:t>
-            </w:r>
+              <w:t>{{</w:t>
+            </w:r>
+            <w:proofErr w:type="spellStart"/>
+            <w:proofErr w:type="gramEnd"/>
             <w:r>
               <w:rPr>
                 <w:b/>
                 <w:bCs/>
                 <w:spacing w:val="-2"/>
               </w:rPr>
-              <w:t>/</w:t>
-            </w:r>
-            <w:r>
-              <w:rPr>
-                <w:b/>
-                <w:bCs/>
-                <w:spacing w:val="-2"/>
-              </w:rPr>
-              <w:t>1/</w:t>
-            </w:r>
-            <w:r>
-              <w:rPr>
-                <w:b/>
-                <w:bCs/>
-                <w:spacing w:val="-2"/>
-              </w:rPr>
-              <w:t>{{year</w:t>
-            </w:r>
+              <w:t>File_Number</w:t>
+            </w:r>
+            <w:proofErr w:type="spellEnd"/>
             <w:proofErr w:type="gramStart"/>
             <w:r>
               <w:rPr>
@@ -167,6 +154,10 @@
             </w:pPr>
             <w:proofErr w:type="gramStart"/>
             <w:r>
+              <w:rPr>
+                <w:b/>
+                <w:bCs/>
+              </w:rPr>
               <w:t>Date:</w:t>
             </w:r>
             <w:r>

</xml_diff>